<commit_message>
Feat: Implementar Laboratorio 06 (Capa Datos, Desconectado, Async/Await)
</commit_message>
<xml_diff>
--- a/daea-lab05-fso.docx
+++ b/daea-lab05-fso.docx
@@ -444,15 +444,7 @@
           <w:u w:val="single"/>
         </w:rPr>
         <w:lastRenderedPageBreak/>
-        <w:t>EXECUTE NONQUERY</w:t>
-      </w:r>
-      <w:r>
-        <w:rPr>
-          <w:b/>
-          <w:bCs/>
-          <w:u w:val="single"/>
-        </w:rPr>
-        <w:t xml:space="preserve"> </w:t>
+        <w:t xml:space="preserve">EXECUTE NONQUERY </w:t>
       </w:r>
       <w:r>
         <w:rPr>
@@ -535,6 +527,13 @@
         </w:rPr>
         <w:t xml:space="preserve">Descarga el archivo </w:t>
       </w:r>
+      <w:r>
+        <w:rPr>
+          <w:sz w:val="20"/>
+          <w:szCs w:val="20"/>
+        </w:rPr>
+        <w:t>Mejora-</w:t>
+      </w:r>
       <w:proofErr w:type="spellStart"/>
       <w:r>
         <w:rPr>
@@ -1214,9 +1213,331 @@
           <w:sz w:val="20"/>
           <w:szCs w:val="20"/>
         </w:rPr>
-        <w:br/>
+        <w:t xml:space="preserve"> </w:t>
+      </w:r>
+      <w:hyperlink r:id="rId12" w:history="1">
+        <w:r>
+          <w:rPr>
+            <w:rStyle w:val="Hipervnculo"/>
+            <w:sz w:val="20"/>
+            <w:szCs w:val="20"/>
+          </w:rPr>
+          <w:t>https://github.com/Dorian-devw/DAEA-lab05.git</w:t>
+        </w:r>
+      </w:hyperlink>
+    </w:p>
+    <w:p>
+      <w:pPr>
+        <w:tabs>
+          <w:tab w:val="left" w:pos="1200"/>
+        </w:tabs>
+        <w:spacing w:line="360" w:lineRule="auto"/>
+        <w:rPr>
+          <w:sz w:val="20"/>
+          <w:szCs w:val="20"/>
+        </w:rPr>
+      </w:pPr>
+      <w:r>
+        <w:rPr>
+          <w:sz w:val="20"/>
+          <w:szCs w:val="20"/>
+        </w:rPr>
         <w:t>Capturas de las vistas:</w:t>
       </w:r>
+    </w:p>
+    <w:p>
+      <w:pPr>
+        <w:tabs>
+          <w:tab w:val="left" w:pos="1200"/>
+        </w:tabs>
+        <w:spacing w:line="360" w:lineRule="auto"/>
+        <w:rPr>
+          <w:sz w:val="20"/>
+          <w:szCs w:val="20"/>
+        </w:rPr>
+      </w:pPr>
+    </w:p>
+    <w:p>
+      <w:pPr>
+        <w:tabs>
+          <w:tab w:val="left" w:pos="1200"/>
+        </w:tabs>
+        <w:spacing w:line="360" w:lineRule="auto"/>
+        <w:rPr>
+          <w:sz w:val="20"/>
+          <w:szCs w:val="20"/>
+        </w:rPr>
+      </w:pPr>
+      <w:r>
+        <w:rPr>
+          <w:sz w:val="20"/>
+          <w:szCs w:val="20"/>
+        </w:rPr>
+        <w:lastRenderedPageBreak/>
+        <w:drawing>
+          <wp:inline distT="0" distB="0" distL="0" distR="0" wp14:anchorId="6FD210DA" wp14:editId="6AC4BC7F">
+            <wp:extent cx="6120130" cy="3738245"/>
+            <wp:effectExtent l="0" t="0" r="0" b="0"/>
+            <wp:docPr id="1693719741" name="Imagen 1"/>
+            <wp:cNvGraphicFramePr>
+              <a:graphicFrameLocks xmlns:a="http://schemas.openxmlformats.org/drawingml/2006/main" noChangeAspect="1"/>
+            </wp:cNvGraphicFramePr>
+            <a:graphic xmlns:a="http://schemas.openxmlformats.org/drawingml/2006/main">
+              <a:graphicData uri="http://schemas.openxmlformats.org/drawingml/2006/picture">
+                <pic:pic xmlns:pic="http://schemas.openxmlformats.org/drawingml/2006/picture">
+                  <pic:nvPicPr>
+                    <pic:cNvPr id="1693719741" name=""/>
+                    <pic:cNvPicPr/>
+                  </pic:nvPicPr>
+                  <pic:blipFill>
+                    <a:blip r:embed="rId13"/>
+                    <a:stretch>
+                      <a:fillRect/>
+                    </a:stretch>
+                  </pic:blipFill>
+                  <pic:spPr>
+                    <a:xfrm>
+                      <a:off x="0" y="0"/>
+                      <a:ext cx="6120130" cy="3738245"/>
+                    </a:xfrm>
+                    <a:prstGeom prst="rect">
+                      <a:avLst/>
+                    </a:prstGeom>
+                  </pic:spPr>
+                </pic:pic>
+              </a:graphicData>
+            </a:graphic>
+          </wp:inline>
+        </w:drawing>
+      </w:r>
+    </w:p>
+    <w:p>
+      <w:pPr>
+        <w:tabs>
+          <w:tab w:val="left" w:pos="1200"/>
+        </w:tabs>
+        <w:spacing w:line="360" w:lineRule="auto"/>
+        <w:rPr>
+          <w:sz w:val="20"/>
+          <w:szCs w:val="20"/>
+        </w:rPr>
+      </w:pPr>
+      <w:r>
+        <w:rPr>
+          <w:sz w:val="20"/>
+          <w:szCs w:val="20"/>
+        </w:rPr>
+        <w:drawing>
+          <wp:inline distT="0" distB="0" distL="0" distR="0" wp14:anchorId="4CE818C2" wp14:editId="02DC85ED">
+            <wp:extent cx="6120130" cy="3740785"/>
+            <wp:effectExtent l="0" t="0" r="0" b="0"/>
+            <wp:docPr id="988215187" name="Imagen 1"/>
+            <wp:cNvGraphicFramePr>
+              <a:graphicFrameLocks xmlns:a="http://schemas.openxmlformats.org/drawingml/2006/main" noChangeAspect="1"/>
+            </wp:cNvGraphicFramePr>
+            <a:graphic xmlns:a="http://schemas.openxmlformats.org/drawingml/2006/main">
+              <a:graphicData uri="http://schemas.openxmlformats.org/drawingml/2006/picture">
+                <pic:pic xmlns:pic="http://schemas.openxmlformats.org/drawingml/2006/picture">
+                  <pic:nvPicPr>
+                    <pic:cNvPr id="988215187" name=""/>
+                    <pic:cNvPicPr/>
+                  </pic:nvPicPr>
+                  <pic:blipFill>
+                    <a:blip r:embed="rId14"/>
+                    <a:stretch>
+                      <a:fillRect/>
+                    </a:stretch>
+                  </pic:blipFill>
+                  <pic:spPr>
+                    <a:xfrm>
+                      <a:off x="0" y="0"/>
+                      <a:ext cx="6120130" cy="3740785"/>
+                    </a:xfrm>
+                    <a:prstGeom prst="rect">
+                      <a:avLst/>
+                    </a:prstGeom>
+                  </pic:spPr>
+                </pic:pic>
+              </a:graphicData>
+            </a:graphic>
+          </wp:inline>
+        </w:drawing>
+      </w:r>
+    </w:p>
+    <w:p>
+      <w:pPr>
+        <w:tabs>
+          <w:tab w:val="left" w:pos="1200"/>
+        </w:tabs>
+        <w:spacing w:line="360" w:lineRule="auto"/>
+        <w:rPr>
+          <w:sz w:val="20"/>
+          <w:szCs w:val="20"/>
+        </w:rPr>
+      </w:pPr>
+      <w:r>
+        <w:rPr>
+          <w:sz w:val="20"/>
+          <w:szCs w:val="20"/>
+        </w:rPr>
+        <w:lastRenderedPageBreak/>
+        <w:drawing>
+          <wp:inline distT="0" distB="0" distL="0" distR="0" wp14:anchorId="35A1661F" wp14:editId="712ED2C6">
+            <wp:extent cx="6120130" cy="3735070"/>
+            <wp:effectExtent l="0" t="0" r="0" b="0"/>
+            <wp:docPr id="1082595887" name="Imagen 1"/>
+            <wp:cNvGraphicFramePr>
+              <a:graphicFrameLocks xmlns:a="http://schemas.openxmlformats.org/drawingml/2006/main" noChangeAspect="1"/>
+            </wp:cNvGraphicFramePr>
+            <a:graphic xmlns:a="http://schemas.openxmlformats.org/drawingml/2006/main">
+              <a:graphicData uri="http://schemas.openxmlformats.org/drawingml/2006/picture">
+                <pic:pic xmlns:pic="http://schemas.openxmlformats.org/drawingml/2006/picture">
+                  <pic:nvPicPr>
+                    <pic:cNvPr id="1082595887" name=""/>
+                    <pic:cNvPicPr/>
+                  </pic:nvPicPr>
+                  <pic:blipFill>
+                    <a:blip r:embed="rId15"/>
+                    <a:stretch>
+                      <a:fillRect/>
+                    </a:stretch>
+                  </pic:blipFill>
+                  <pic:spPr>
+                    <a:xfrm>
+                      <a:off x="0" y="0"/>
+                      <a:ext cx="6120130" cy="3735070"/>
+                    </a:xfrm>
+                    <a:prstGeom prst="rect">
+                      <a:avLst/>
+                    </a:prstGeom>
+                  </pic:spPr>
+                </pic:pic>
+              </a:graphicData>
+            </a:graphic>
+          </wp:inline>
+        </w:drawing>
+      </w:r>
+    </w:p>
+    <w:p>
+      <w:pPr>
+        <w:tabs>
+          <w:tab w:val="left" w:pos="1200"/>
+        </w:tabs>
+        <w:spacing w:line="360" w:lineRule="auto"/>
+        <w:rPr>
+          <w:sz w:val="20"/>
+          <w:szCs w:val="20"/>
+        </w:rPr>
+      </w:pPr>
+      <w:r>
+        <w:rPr>
+          <w:sz w:val="20"/>
+          <w:szCs w:val="20"/>
+        </w:rPr>
+        <w:drawing>
+          <wp:inline distT="0" distB="0" distL="0" distR="0" wp14:anchorId="2B05F1F1" wp14:editId="0ADFB74A">
+            <wp:extent cx="6120130" cy="3740785"/>
+            <wp:effectExtent l="0" t="0" r="0" b="0"/>
+            <wp:docPr id="63296189" name="Imagen 1"/>
+            <wp:cNvGraphicFramePr>
+              <a:graphicFrameLocks xmlns:a="http://schemas.openxmlformats.org/drawingml/2006/main" noChangeAspect="1"/>
+            </wp:cNvGraphicFramePr>
+            <a:graphic xmlns:a="http://schemas.openxmlformats.org/drawingml/2006/main">
+              <a:graphicData uri="http://schemas.openxmlformats.org/drawingml/2006/picture">
+                <pic:pic xmlns:pic="http://schemas.openxmlformats.org/drawingml/2006/picture">
+                  <pic:nvPicPr>
+                    <pic:cNvPr id="63296189" name=""/>
+                    <pic:cNvPicPr/>
+                  </pic:nvPicPr>
+                  <pic:blipFill>
+                    <a:blip r:embed="rId16"/>
+                    <a:stretch>
+                      <a:fillRect/>
+                    </a:stretch>
+                  </pic:blipFill>
+                  <pic:spPr>
+                    <a:xfrm>
+                      <a:off x="0" y="0"/>
+                      <a:ext cx="6120130" cy="3740785"/>
+                    </a:xfrm>
+                    <a:prstGeom prst="rect">
+                      <a:avLst/>
+                    </a:prstGeom>
+                  </pic:spPr>
+                </pic:pic>
+              </a:graphicData>
+            </a:graphic>
+          </wp:inline>
+        </w:drawing>
+      </w:r>
+    </w:p>
+    <w:p>
+      <w:pPr>
+        <w:tabs>
+          <w:tab w:val="left" w:pos="1200"/>
+        </w:tabs>
+        <w:spacing w:line="360" w:lineRule="auto"/>
+        <w:rPr>
+          <w:sz w:val="20"/>
+          <w:szCs w:val="20"/>
+        </w:rPr>
+      </w:pPr>
+      <w:r>
+        <w:rPr>
+          <w:sz w:val="20"/>
+          <w:szCs w:val="20"/>
+        </w:rPr>
+        <w:lastRenderedPageBreak/>
+        <w:drawing>
+          <wp:inline distT="0" distB="0" distL="0" distR="0" wp14:anchorId="114149CF" wp14:editId="67BF24C4">
+            <wp:extent cx="6120130" cy="3736340"/>
+            <wp:effectExtent l="0" t="0" r="0" b="0"/>
+            <wp:docPr id="1161583629" name="Imagen 1"/>
+            <wp:cNvGraphicFramePr>
+              <a:graphicFrameLocks xmlns:a="http://schemas.openxmlformats.org/drawingml/2006/main" noChangeAspect="1"/>
+            </wp:cNvGraphicFramePr>
+            <a:graphic xmlns:a="http://schemas.openxmlformats.org/drawingml/2006/main">
+              <a:graphicData uri="http://schemas.openxmlformats.org/drawingml/2006/picture">
+                <pic:pic xmlns:pic="http://schemas.openxmlformats.org/drawingml/2006/picture">
+                  <pic:nvPicPr>
+                    <pic:cNvPr id="1161583629" name=""/>
+                    <pic:cNvPicPr/>
+                  </pic:nvPicPr>
+                  <pic:blipFill>
+                    <a:blip r:embed="rId17"/>
+                    <a:stretch>
+                      <a:fillRect/>
+                    </a:stretch>
+                  </pic:blipFill>
+                  <pic:spPr>
+                    <a:xfrm>
+                      <a:off x="0" y="0"/>
+                      <a:ext cx="6120130" cy="3736340"/>
+                    </a:xfrm>
+                    <a:prstGeom prst="rect">
+                      <a:avLst/>
+                    </a:prstGeom>
+                  </pic:spPr>
+                </pic:pic>
+              </a:graphicData>
+            </a:graphic>
+          </wp:inline>
+        </w:drawing>
+      </w:r>
+    </w:p>
+    <w:p>
+      <w:pPr>
+        <w:tabs>
+          <w:tab w:val="left" w:pos="1200"/>
+        </w:tabs>
+        <w:spacing w:line="360" w:lineRule="auto"/>
+        <w:rPr>
+          <w:b/>
+          <w:bCs/>
+          <w:sz w:val="20"/>
+          <w:szCs w:val="20"/>
+        </w:rPr>
+      </w:pPr>
       <w:r>
         <w:rPr>
           <w:sz w:val="20"/>
@@ -1254,20 +1575,1095 @@
         </w:rPr>
         <w:t xml:space="preserve"> en cada operación de escritura y cómo se resolvió la eliminación lógica (campo Activo y su verificación en los listados/consultas).</w:t>
       </w:r>
-      <w:r>
-        <w:rPr>
-          <w:sz w:val="20"/>
-          <w:szCs w:val="20"/>
+    </w:p>
+    <w:p>
+      <w:pPr>
+        <w:tabs>
+          <w:tab w:val="left" w:pos="1200"/>
+        </w:tabs>
+        <w:spacing w:line="360" w:lineRule="auto"/>
+        <w:rPr>
+          <w:b/>
+          <w:bCs/>
+          <w:sz w:val="20"/>
+          <w:szCs w:val="20"/>
+          <w:lang w:val="es-MX"/>
+        </w:rPr>
+      </w:pPr>
+    </w:p>
+    <w:p>
+      <w:pPr>
+        <w:tabs>
+          <w:tab w:val="left" w:pos="1200"/>
+        </w:tabs>
+        <w:spacing w:line="360" w:lineRule="auto"/>
+        <w:rPr>
+          <w:b/>
+          <w:bCs/>
+          <w:sz w:val="20"/>
+          <w:szCs w:val="20"/>
+          <w:lang w:val="es-MX"/>
+        </w:rPr>
+      </w:pPr>
+    </w:p>
+    <w:p>
+      <w:pPr>
+        <w:tabs>
+          <w:tab w:val="left" w:pos="1200"/>
+        </w:tabs>
+        <w:spacing w:line="360" w:lineRule="auto"/>
+        <w:rPr>
+          <w:b/>
+          <w:bCs/>
+          <w:sz w:val="20"/>
+          <w:szCs w:val="20"/>
+          <w:lang w:val="es-MX"/>
+        </w:rPr>
+      </w:pPr>
+    </w:p>
+    <w:p>
+      <w:pPr>
+        <w:tabs>
+          <w:tab w:val="left" w:pos="1200"/>
+        </w:tabs>
+        <w:spacing w:line="360" w:lineRule="auto"/>
+        <w:rPr>
+          <w:b/>
+          <w:bCs/>
+          <w:sz w:val="20"/>
+          <w:szCs w:val="20"/>
+          <w:lang w:val="es-MX"/>
+        </w:rPr>
+      </w:pPr>
+    </w:p>
+    <w:p>
+      <w:pPr>
+        <w:tabs>
+          <w:tab w:val="left" w:pos="1200"/>
+        </w:tabs>
+        <w:spacing w:line="360" w:lineRule="auto"/>
+        <w:rPr>
+          <w:b/>
+          <w:bCs/>
+          <w:sz w:val="20"/>
+          <w:szCs w:val="20"/>
+          <w:lang w:val="es-MX"/>
+        </w:rPr>
+      </w:pPr>
+    </w:p>
+    <w:p>
+      <w:pPr>
+        <w:tabs>
+          <w:tab w:val="left" w:pos="1200"/>
+        </w:tabs>
+        <w:spacing w:line="360" w:lineRule="auto"/>
+        <w:rPr>
+          <w:b/>
+          <w:bCs/>
+          <w:sz w:val="20"/>
+          <w:szCs w:val="20"/>
+          <w:lang w:val="es-MX"/>
+        </w:rPr>
+      </w:pPr>
+    </w:p>
+    <w:p>
+      <w:pPr>
+        <w:tabs>
+          <w:tab w:val="left" w:pos="1200"/>
+        </w:tabs>
+        <w:spacing w:line="360" w:lineRule="auto"/>
+        <w:rPr>
+          <w:b/>
+          <w:bCs/>
+          <w:sz w:val="20"/>
+          <w:szCs w:val="20"/>
+          <w:lang w:val="es-MX"/>
+        </w:rPr>
+      </w:pPr>
+    </w:p>
+    <w:p>
+      <w:pPr>
+        <w:tabs>
+          <w:tab w:val="left" w:pos="1200"/>
+        </w:tabs>
+        <w:spacing w:line="360" w:lineRule="auto"/>
+        <w:rPr>
+          <w:sz w:val="20"/>
+          <w:szCs w:val="20"/>
+          <w:lang w:val="es-MX"/>
+        </w:rPr>
+      </w:pPr>
+      <w:r>
+        <w:rPr>
+          <w:sz w:val="20"/>
+          <w:szCs w:val="20"/>
+          <w:lang w:val="es-MX"/>
+        </w:rPr>
+        <w:lastRenderedPageBreak/>
+        <w:t xml:space="preserve">Nos conectamos por el </w:t>
+      </w:r>
+      <w:proofErr w:type="spellStart"/>
+      <w:r>
+        <w:rPr>
+          <w:sz w:val="20"/>
+          <w:szCs w:val="20"/>
+          <w:lang w:val="es-MX"/>
+        </w:rPr>
+        <w:t>DatabaseHelper.cs</w:t>
+      </w:r>
+      <w:proofErr w:type="spellEnd"/>
+      <w:r>
+        <w:rPr>
+          <w:sz w:val="20"/>
+          <w:szCs w:val="20"/>
+          <w:lang w:val="es-MX"/>
+        </w:rPr>
+        <w:t xml:space="preserve"> </w:t>
+      </w:r>
+      <w:r>
+        <w:rPr>
+          <w:sz w:val="20"/>
+          <w:szCs w:val="20"/>
+          <w:lang w:val="es-MX"/>
         </w:rPr>
         <w:br/>
-        <w:t>Observaciones y Conclusiones:</w:t>
-      </w:r>
+      </w:r>
+      <w:r>
+        <w:rPr>
+          <w:sz w:val="20"/>
+          <w:szCs w:val="20"/>
+          <w:lang w:val="es-MX"/>
+        </w:rPr>
+        <w:drawing>
+          <wp:inline distT="0" distB="0" distL="0" distR="0" wp14:anchorId="2775E917" wp14:editId="0879B6C1">
+            <wp:extent cx="6120130" cy="1979930"/>
+            <wp:effectExtent l="0" t="0" r="0" b="1270"/>
+            <wp:docPr id="896943659" name="Imagen 1"/>
+            <wp:cNvGraphicFramePr>
+              <a:graphicFrameLocks xmlns:a="http://schemas.openxmlformats.org/drawingml/2006/main" noChangeAspect="1"/>
+            </wp:cNvGraphicFramePr>
+            <a:graphic xmlns:a="http://schemas.openxmlformats.org/drawingml/2006/main">
+              <a:graphicData uri="http://schemas.openxmlformats.org/drawingml/2006/picture">
+                <pic:pic xmlns:pic="http://schemas.openxmlformats.org/drawingml/2006/picture">
+                  <pic:nvPicPr>
+                    <pic:cNvPr id="896943659" name=""/>
+                    <pic:cNvPicPr/>
+                  </pic:nvPicPr>
+                  <pic:blipFill>
+                    <a:blip r:embed="rId18"/>
+                    <a:stretch>
+                      <a:fillRect/>
+                    </a:stretch>
+                  </pic:blipFill>
+                  <pic:spPr>
+                    <a:xfrm>
+                      <a:off x="0" y="0"/>
+                      <a:ext cx="6120130" cy="1979930"/>
+                    </a:xfrm>
+                    <a:prstGeom prst="rect">
+                      <a:avLst/>
+                    </a:prstGeom>
+                  </pic:spPr>
+                </pic:pic>
+              </a:graphicData>
+            </a:graphic>
+          </wp:inline>
+        </w:drawing>
+      </w:r>
+    </w:p>
+    <w:p>
+      <w:pPr>
+        <w:tabs>
+          <w:tab w:val="left" w:pos="1200"/>
+        </w:tabs>
+        <w:spacing w:line="360" w:lineRule="auto"/>
+        <w:rPr>
+          <w:sz w:val="20"/>
+          <w:szCs w:val="20"/>
+        </w:rPr>
+      </w:pPr>
+      <w:r>
+        <w:rPr>
+          <w:sz w:val="20"/>
+          <w:szCs w:val="20"/>
+        </w:rPr>
+        <w:t xml:space="preserve">En </w:t>
+      </w:r>
+      <w:proofErr w:type="spellStart"/>
+      <w:r>
+        <w:rPr>
+          <w:sz w:val="20"/>
+          <w:szCs w:val="20"/>
+        </w:rPr>
+        <w:t>ProductoRepository.cs</w:t>
+      </w:r>
+      <w:proofErr w:type="spellEnd"/>
+      <w:r>
+        <w:rPr>
+          <w:sz w:val="20"/>
+          <w:szCs w:val="20"/>
+        </w:rPr>
+        <w:t xml:space="preserve"> apuntamos a </w:t>
+      </w:r>
+      <w:proofErr w:type="spellStart"/>
+      <w:r>
+        <w:rPr>
+          <w:sz w:val="20"/>
+          <w:szCs w:val="20"/>
+        </w:rPr>
+        <w:t>stored</w:t>
+      </w:r>
+      <w:proofErr w:type="spellEnd"/>
       <w:r>
         <w:rPr>
           <w:sz w:val="20"/>
           <w:szCs w:val="20"/>
         </w:rPr>
         <w:t xml:space="preserve"> </w:t>
+      </w:r>
+      <w:proofErr w:type="spellStart"/>
+      <w:r>
+        <w:rPr>
+          <w:sz w:val="20"/>
+          <w:szCs w:val="20"/>
+        </w:rPr>
+        <w:t>procedure</w:t>
+      </w:r>
+      <w:proofErr w:type="spellEnd"/>
+      <w:r>
+        <w:rPr>
+          <w:sz w:val="20"/>
+          <w:szCs w:val="20"/>
+        </w:rPr>
+        <w:t xml:space="preserve"> que necesitamos por ejemplo </w:t>
+      </w:r>
+      <w:proofErr w:type="spellStart"/>
+      <w:r>
+        <w:rPr>
+          <w:sz w:val="20"/>
+          <w:szCs w:val="20"/>
+        </w:rPr>
+        <w:t>sp_EliminarProducto</w:t>
+      </w:r>
+      <w:proofErr w:type="spellEnd"/>
+      <w:r>
+        <w:rPr>
+          <w:sz w:val="20"/>
+          <w:szCs w:val="20"/>
+        </w:rPr>
+        <w:t xml:space="preserve"> (4ta imagen)</w:t>
+      </w:r>
+      <w:r>
+        <w:rPr>
+          <w:noProof/>
+        </w:rPr>
+        <w:t xml:space="preserve"> </w:t>
+      </w:r>
+    </w:p>
+    <w:p>
+      <w:pPr>
+        <w:tabs>
+          <w:tab w:val="left" w:pos="1200"/>
+        </w:tabs>
+        <w:spacing w:line="360" w:lineRule="auto"/>
+        <w:rPr>
+          <w:b/>
+          <w:bCs/>
+          <w:sz w:val="20"/>
+          <w:szCs w:val="20"/>
+        </w:rPr>
+      </w:pPr>
+      <w:r>
+        <w:rPr>
+          <w:b/>
+          <w:bCs/>
+          <w:sz w:val="20"/>
+          <w:szCs w:val="20"/>
+        </w:rPr>
+        <w:drawing>
+          <wp:inline distT="0" distB="0" distL="0" distR="0" wp14:anchorId="0003BC43" wp14:editId="7F63DCEF">
+            <wp:extent cx="6120130" cy="4955540"/>
+            <wp:effectExtent l="0" t="0" r="0" b="0"/>
+            <wp:docPr id="1753749692" name="Imagen 1"/>
+            <wp:cNvGraphicFramePr>
+              <a:graphicFrameLocks xmlns:a="http://schemas.openxmlformats.org/drawingml/2006/main" noChangeAspect="1"/>
+            </wp:cNvGraphicFramePr>
+            <a:graphic xmlns:a="http://schemas.openxmlformats.org/drawingml/2006/main">
+              <a:graphicData uri="http://schemas.openxmlformats.org/drawingml/2006/picture">
+                <pic:pic xmlns:pic="http://schemas.openxmlformats.org/drawingml/2006/picture">
+                  <pic:nvPicPr>
+                    <pic:cNvPr id="1753749692" name=""/>
+                    <pic:cNvPicPr/>
+                  </pic:nvPicPr>
+                  <pic:blipFill>
+                    <a:blip r:embed="rId19"/>
+                    <a:stretch>
+                      <a:fillRect/>
+                    </a:stretch>
+                  </pic:blipFill>
+                  <pic:spPr>
+                    <a:xfrm>
+                      <a:off x="0" y="0"/>
+                      <a:ext cx="6120130" cy="4955540"/>
+                    </a:xfrm>
+                    <a:prstGeom prst="rect">
+                      <a:avLst/>
+                    </a:prstGeom>
+                  </pic:spPr>
+                </pic:pic>
+              </a:graphicData>
+            </a:graphic>
+          </wp:inline>
+        </w:drawing>
+      </w:r>
+    </w:p>
+    <w:p>
+      <w:pPr>
+        <w:tabs>
+          <w:tab w:val="left" w:pos="1200"/>
+        </w:tabs>
+        <w:spacing w:line="360" w:lineRule="auto"/>
+        <w:rPr>
+          <w:b/>
+          <w:bCs/>
+          <w:sz w:val="20"/>
+          <w:szCs w:val="20"/>
+        </w:rPr>
+      </w:pPr>
+      <w:r>
+        <w:rPr>
+          <w:b/>
+          <w:bCs/>
+          <w:sz w:val="20"/>
+          <w:szCs w:val="20"/>
+        </w:rPr>
+        <w:lastRenderedPageBreak/>
+        <w:drawing>
+          <wp:inline distT="0" distB="0" distL="0" distR="0" wp14:anchorId="5D93D62F" wp14:editId="44806A83">
+            <wp:extent cx="6120130" cy="3075305"/>
+            <wp:effectExtent l="0" t="0" r="0" b="0"/>
+            <wp:docPr id="802133630" name="Imagen 1"/>
+            <wp:cNvGraphicFramePr>
+              <a:graphicFrameLocks xmlns:a="http://schemas.openxmlformats.org/drawingml/2006/main" noChangeAspect="1"/>
+            </wp:cNvGraphicFramePr>
+            <a:graphic xmlns:a="http://schemas.openxmlformats.org/drawingml/2006/main">
+              <a:graphicData uri="http://schemas.openxmlformats.org/drawingml/2006/picture">
+                <pic:pic xmlns:pic="http://schemas.openxmlformats.org/drawingml/2006/picture">
+                  <pic:nvPicPr>
+                    <pic:cNvPr id="802133630" name=""/>
+                    <pic:cNvPicPr/>
+                  </pic:nvPicPr>
+                  <pic:blipFill>
+                    <a:blip r:embed="rId20"/>
+                    <a:stretch>
+                      <a:fillRect/>
+                    </a:stretch>
+                  </pic:blipFill>
+                  <pic:spPr>
+                    <a:xfrm>
+                      <a:off x="0" y="0"/>
+                      <a:ext cx="6120130" cy="3075305"/>
+                    </a:xfrm>
+                    <a:prstGeom prst="rect">
+                      <a:avLst/>
+                    </a:prstGeom>
+                  </pic:spPr>
+                </pic:pic>
+              </a:graphicData>
+            </a:graphic>
+          </wp:inline>
+        </w:drawing>
+      </w:r>
+    </w:p>
+    <w:p>
+      <w:pPr>
+        <w:tabs>
+          <w:tab w:val="left" w:pos="1200"/>
+        </w:tabs>
+        <w:spacing w:line="360" w:lineRule="auto"/>
+        <w:rPr>
+          <w:b/>
+          <w:bCs/>
+          <w:sz w:val="20"/>
+          <w:szCs w:val="20"/>
+        </w:rPr>
+      </w:pPr>
+      <w:r>
+        <w:rPr>
+          <w:b/>
+          <w:bCs/>
+          <w:sz w:val="20"/>
+          <w:szCs w:val="20"/>
+        </w:rPr>
+        <w:drawing>
+          <wp:inline distT="0" distB="0" distL="0" distR="0" wp14:anchorId="5440AC30" wp14:editId="1A31D308">
+            <wp:extent cx="6120130" cy="3293110"/>
+            <wp:effectExtent l="0" t="0" r="0" b="2540"/>
+            <wp:docPr id="46066913" name="Imagen 1"/>
+            <wp:cNvGraphicFramePr>
+              <a:graphicFrameLocks xmlns:a="http://schemas.openxmlformats.org/drawingml/2006/main" noChangeAspect="1"/>
+            </wp:cNvGraphicFramePr>
+            <a:graphic xmlns:a="http://schemas.openxmlformats.org/drawingml/2006/main">
+              <a:graphicData uri="http://schemas.openxmlformats.org/drawingml/2006/picture">
+                <pic:pic xmlns:pic="http://schemas.openxmlformats.org/drawingml/2006/picture">
+                  <pic:nvPicPr>
+                    <pic:cNvPr id="46066913" name=""/>
+                    <pic:cNvPicPr/>
+                  </pic:nvPicPr>
+                  <pic:blipFill>
+                    <a:blip r:embed="rId21"/>
+                    <a:stretch>
+                      <a:fillRect/>
+                    </a:stretch>
+                  </pic:blipFill>
+                  <pic:spPr>
+                    <a:xfrm>
+                      <a:off x="0" y="0"/>
+                      <a:ext cx="6120130" cy="3293110"/>
+                    </a:xfrm>
+                    <a:prstGeom prst="rect">
+                      <a:avLst/>
+                    </a:prstGeom>
+                  </pic:spPr>
+                </pic:pic>
+              </a:graphicData>
+            </a:graphic>
+          </wp:inline>
+        </w:drawing>
+      </w:r>
+    </w:p>
+    <w:p>
+      <w:pPr>
+        <w:tabs>
+          <w:tab w:val="left" w:pos="1200"/>
+        </w:tabs>
+        <w:spacing w:line="360" w:lineRule="auto"/>
+        <w:rPr>
+          <w:sz w:val="20"/>
+          <w:szCs w:val="20"/>
+        </w:rPr>
+      </w:pPr>
+    </w:p>
+    <w:p>
+      <w:pPr>
+        <w:tabs>
+          <w:tab w:val="left" w:pos="1200"/>
+        </w:tabs>
+        <w:spacing w:line="360" w:lineRule="auto"/>
+        <w:rPr>
+          <w:sz w:val="20"/>
+          <w:szCs w:val="20"/>
+        </w:rPr>
+      </w:pPr>
+    </w:p>
+    <w:p>
+      <w:pPr>
+        <w:tabs>
+          <w:tab w:val="left" w:pos="1200"/>
+        </w:tabs>
+        <w:spacing w:line="360" w:lineRule="auto"/>
+        <w:rPr>
+          <w:sz w:val="20"/>
+          <w:szCs w:val="20"/>
+        </w:rPr>
+      </w:pPr>
+    </w:p>
+    <w:p>
+      <w:pPr>
+        <w:tabs>
+          <w:tab w:val="left" w:pos="1200"/>
+        </w:tabs>
+        <w:spacing w:line="360" w:lineRule="auto"/>
+        <w:rPr>
+          <w:sz w:val="20"/>
+          <w:szCs w:val="20"/>
+        </w:rPr>
+      </w:pPr>
+    </w:p>
+    <w:p>
+      <w:pPr>
+        <w:tabs>
+          <w:tab w:val="left" w:pos="1200"/>
+        </w:tabs>
+        <w:spacing w:line="360" w:lineRule="auto"/>
+        <w:rPr>
+          <w:sz w:val="20"/>
+          <w:szCs w:val="20"/>
+        </w:rPr>
+      </w:pPr>
+    </w:p>
+    <w:p>
+      <w:pPr>
+        <w:tabs>
+          <w:tab w:val="left" w:pos="1200"/>
+        </w:tabs>
+        <w:spacing w:line="360" w:lineRule="auto"/>
+        <w:rPr>
+          <w:sz w:val="20"/>
+          <w:szCs w:val="20"/>
+        </w:rPr>
+      </w:pPr>
+    </w:p>
+    <w:p>
+      <w:pPr>
+        <w:tabs>
+          <w:tab w:val="left" w:pos="1200"/>
+        </w:tabs>
+        <w:spacing w:line="360" w:lineRule="auto"/>
+        <w:rPr>
+          <w:sz w:val="20"/>
+          <w:szCs w:val="20"/>
+        </w:rPr>
+      </w:pPr>
+      <w:r>
+        <w:rPr>
+          <w:sz w:val="20"/>
+          <w:szCs w:val="20"/>
+        </w:rPr>
+        <w:lastRenderedPageBreak/>
+        <w:t xml:space="preserve">Se aplica directamente el procedo lógico y no es que borra como tal un producto, ya que esto afectaría pedidos con este producto que “fue eliminado”, es por ello que se hace aplica un estado como tal, que modifica a 1 o 0 si este es borrado o no en la aplicación. Algo que se ve reflejado en el store </w:t>
+      </w:r>
+      <w:proofErr w:type="spellStart"/>
+      <w:r>
+        <w:rPr>
+          <w:sz w:val="20"/>
+          <w:szCs w:val="20"/>
+        </w:rPr>
+        <w:t>procedure</w:t>
+      </w:r>
+      <w:proofErr w:type="spellEnd"/>
+      <w:r>
+        <w:rPr>
+          <w:sz w:val="20"/>
+          <w:szCs w:val="20"/>
+        </w:rPr>
+        <w:t xml:space="preserve"> de Eliminar Producto. “</w:t>
+      </w:r>
+      <w:proofErr w:type="spellStart"/>
+      <w:r>
+        <w:rPr>
+          <w:sz w:val="20"/>
+          <w:szCs w:val="20"/>
+        </w:rPr>
+        <w:t>sp_EliminarProductoLogico</w:t>
+      </w:r>
+      <w:proofErr w:type="spellEnd"/>
+      <w:r>
+        <w:rPr>
+          <w:sz w:val="20"/>
+          <w:szCs w:val="20"/>
+        </w:rPr>
+        <w:t>”</w:t>
+      </w:r>
+      <w:r>
+        <w:rPr>
+          <w:sz w:val="20"/>
+          <w:szCs w:val="20"/>
+        </w:rPr>
+        <w:br/>
+      </w:r>
+      <w:r>
+        <w:rPr>
+          <w:sz w:val="20"/>
+          <w:szCs w:val="20"/>
+        </w:rPr>
+        <w:drawing>
+          <wp:inline distT="0" distB="0" distL="0" distR="0" wp14:anchorId="6CBF0E9A" wp14:editId="619F37AD">
+            <wp:extent cx="6120130" cy="2678430"/>
+            <wp:effectExtent l="57150" t="57150" r="52070" b="64770"/>
+            <wp:docPr id="1816327402" name="Imagen 1"/>
+            <wp:cNvGraphicFramePr>
+              <a:graphicFrameLocks xmlns:a="http://schemas.openxmlformats.org/drawingml/2006/main" noChangeAspect="1"/>
+            </wp:cNvGraphicFramePr>
+            <a:graphic xmlns:a="http://schemas.openxmlformats.org/drawingml/2006/main">
+              <a:graphicData uri="http://schemas.openxmlformats.org/drawingml/2006/picture">
+                <pic:pic xmlns:pic="http://schemas.openxmlformats.org/drawingml/2006/picture">
+                  <pic:nvPicPr>
+                    <pic:cNvPr id="1816327402" name=""/>
+                    <pic:cNvPicPr/>
+                  </pic:nvPicPr>
+                  <pic:blipFill>
+                    <a:blip r:embed="rId22"/>
+                    <a:stretch>
+                      <a:fillRect/>
+                    </a:stretch>
+                  </pic:blipFill>
+                  <pic:spPr>
+                    <a:xfrm>
+                      <a:off x="0" y="0"/>
+                      <a:ext cx="6120130" cy="2678430"/>
+                    </a:xfrm>
+                    <a:prstGeom prst="rect">
+                      <a:avLst/>
+                    </a:prstGeom>
+                    <a:ln w="57150">
+                      <a:solidFill>
+                        <a:schemeClr val="accent4"/>
+                      </a:solidFill>
+                    </a:ln>
+                  </pic:spPr>
+                </pic:pic>
+              </a:graphicData>
+            </a:graphic>
+          </wp:inline>
+        </w:drawing>
+      </w:r>
+    </w:p>
+    <w:p>
+      <w:pPr>
+        <w:tabs>
+          <w:tab w:val="left" w:pos="1200"/>
+        </w:tabs>
+        <w:spacing w:line="360" w:lineRule="auto"/>
+        <w:rPr>
+          <w:sz w:val="20"/>
+          <w:szCs w:val="20"/>
+        </w:rPr>
+      </w:pPr>
+      <w:r>
+        <w:rPr>
+          <w:b/>
+          <w:bCs/>
+          <w:sz w:val="20"/>
+          <w:szCs w:val="20"/>
+        </w:rPr>
+        <w:drawing>
+          <wp:inline distT="0" distB="0" distL="0" distR="0" wp14:anchorId="72B5A774" wp14:editId="3EBDD601">
+            <wp:extent cx="6120130" cy="2910205"/>
+            <wp:effectExtent l="57150" t="57150" r="52070" b="61595"/>
+            <wp:docPr id="1102731485" name="Imagen 1"/>
+            <wp:cNvGraphicFramePr>
+              <a:graphicFrameLocks xmlns:a="http://schemas.openxmlformats.org/drawingml/2006/main" noChangeAspect="1"/>
+            </wp:cNvGraphicFramePr>
+            <a:graphic xmlns:a="http://schemas.openxmlformats.org/drawingml/2006/main">
+              <a:graphicData uri="http://schemas.openxmlformats.org/drawingml/2006/picture">
+                <pic:pic xmlns:pic="http://schemas.openxmlformats.org/drawingml/2006/picture">
+                  <pic:nvPicPr>
+                    <pic:cNvPr id="1102731485" name=""/>
+                    <pic:cNvPicPr/>
+                  </pic:nvPicPr>
+                  <pic:blipFill>
+                    <a:blip r:embed="rId23"/>
+                    <a:stretch>
+                      <a:fillRect/>
+                    </a:stretch>
+                  </pic:blipFill>
+                  <pic:spPr>
+                    <a:xfrm>
+                      <a:off x="0" y="0"/>
+                      <a:ext cx="6120130" cy="2910205"/>
+                    </a:xfrm>
+                    <a:prstGeom prst="rect">
+                      <a:avLst/>
+                    </a:prstGeom>
+                    <a:ln w="57150">
+                      <a:solidFill>
+                        <a:schemeClr val="accent4"/>
+                      </a:solidFill>
+                    </a:ln>
+                  </pic:spPr>
+                </pic:pic>
+              </a:graphicData>
+            </a:graphic>
+          </wp:inline>
+        </w:drawing>
+      </w:r>
+      <w:r>
+        <w:rPr>
+          <w:sz w:val="20"/>
+          <w:szCs w:val="20"/>
+        </w:rPr>
+        <w:br/>
+        <w:t xml:space="preserve">Observaciones y </w:t>
+      </w:r>
+    </w:p>
+    <w:p>
+      <w:pPr>
+        <w:numPr>
+          <w:ilvl w:val="0"/>
+          <w:numId w:val="36"/>
+        </w:numPr>
+        <w:tabs>
+          <w:tab w:val="left" w:pos="1200"/>
+        </w:tabs>
+        <w:spacing w:line="360" w:lineRule="auto"/>
+        <w:rPr>
+          <w:sz w:val="20"/>
+          <w:szCs w:val="20"/>
+          <w:lang w:val="es-MX"/>
+        </w:rPr>
+      </w:pPr>
+      <w:r>
+        <w:rPr>
+          <w:sz w:val="20"/>
+          <w:szCs w:val="20"/>
+          <w:lang w:val="es-MX"/>
+        </w:rPr>
+        <w:t>Durante el desarrollo del proyecto, noté que implementar el patrón MVVM en WPF tiene una curva de aprendizaje inicial al tener que usar </w:t>
+      </w:r>
+      <w:proofErr w:type="spellStart"/>
+      <w:r>
+        <w:rPr>
+          <w:sz w:val="20"/>
+          <w:szCs w:val="20"/>
+          <w:lang w:val="es-MX"/>
+        </w:rPr>
+        <w:t>DataBindings</w:t>
+      </w:r>
+      <w:proofErr w:type="spellEnd"/>
+      <w:r>
+        <w:rPr>
+          <w:sz w:val="20"/>
+          <w:szCs w:val="20"/>
+          <w:lang w:val="es-MX"/>
+        </w:rPr>
+        <w:t> e interfaces como </w:t>
+      </w:r>
+      <w:proofErr w:type="spellStart"/>
+      <w:r>
+        <w:rPr>
+          <w:sz w:val="20"/>
+          <w:szCs w:val="20"/>
+          <w:lang w:val="es-MX"/>
+        </w:rPr>
+        <w:t>ICommand</w:t>
+      </w:r>
+      <w:proofErr w:type="spellEnd"/>
+      <w:r>
+        <w:rPr>
+          <w:sz w:val="20"/>
+          <w:szCs w:val="20"/>
+          <w:lang w:val="es-MX"/>
+        </w:rPr>
+        <w:t xml:space="preserve">, pero a cambio logré que el código de la interfaz gráfica </w:t>
+      </w:r>
+      <w:proofErr w:type="gramStart"/>
+      <w:r>
+        <w:rPr>
+          <w:sz w:val="20"/>
+          <w:szCs w:val="20"/>
+          <w:lang w:val="es-MX"/>
+        </w:rPr>
+        <w:t>(.</w:t>
+      </w:r>
+      <w:proofErr w:type="spellStart"/>
+      <w:r>
+        <w:rPr>
+          <w:sz w:val="20"/>
+          <w:szCs w:val="20"/>
+          <w:lang w:val="es-MX"/>
+        </w:rPr>
+        <w:t>xaml.cs</w:t>
+      </w:r>
+      <w:proofErr w:type="spellEnd"/>
+      <w:proofErr w:type="gramEnd"/>
+      <w:r>
+        <w:rPr>
+          <w:sz w:val="20"/>
+          <w:szCs w:val="20"/>
+          <w:lang w:val="es-MX"/>
+        </w:rPr>
+        <w:t xml:space="preserve">) </w:t>
+      </w:r>
+      <w:proofErr w:type="gramStart"/>
+      <w:r>
+        <w:rPr>
+          <w:sz w:val="20"/>
+          <w:szCs w:val="20"/>
+          <w:lang w:val="es-MX"/>
+        </w:rPr>
+        <w:t>quede</w:t>
+      </w:r>
+      <w:proofErr w:type="gramEnd"/>
+      <w:r>
+        <w:rPr>
+          <w:sz w:val="20"/>
+          <w:szCs w:val="20"/>
+          <w:lang w:val="es-MX"/>
+        </w:rPr>
+        <w:t xml:space="preserve"> completamente limpio de operaciones de base de datos.</w:t>
+      </w:r>
+    </w:p>
+    <w:p>
+      <w:pPr>
+        <w:numPr>
+          <w:ilvl w:val="0"/>
+          <w:numId w:val="36"/>
+        </w:numPr>
+        <w:tabs>
+          <w:tab w:val="left" w:pos="1200"/>
+        </w:tabs>
+        <w:spacing w:line="360" w:lineRule="auto"/>
+        <w:rPr>
+          <w:sz w:val="20"/>
+          <w:szCs w:val="20"/>
+          <w:lang w:val="es-MX"/>
+        </w:rPr>
+      </w:pPr>
+      <w:r>
+        <w:rPr>
+          <w:sz w:val="20"/>
+          <w:szCs w:val="20"/>
+          <w:lang w:val="es-MX"/>
+        </w:rPr>
+        <w:t>Al diseñar las vistas, observé que los controles por defecto de WPF lucen bastante anticuados para los estándares actuales. Fue necesario crear estilos globales y modificar plantillas (especialmente en los </w:t>
+      </w:r>
+      <w:proofErr w:type="spellStart"/>
+      <w:r>
+        <w:rPr>
+          <w:sz w:val="20"/>
+          <w:szCs w:val="20"/>
+          <w:lang w:val="es-MX"/>
+        </w:rPr>
+        <w:t>DataGrid</w:t>
+      </w:r>
+      <w:proofErr w:type="spellEnd"/>
+      <w:r>
+        <w:rPr>
+          <w:sz w:val="20"/>
+          <w:szCs w:val="20"/>
+          <w:lang w:val="es-MX"/>
+        </w:rPr>
+        <w:t> y botones) para lograr una apariencia plana, moderna y profesional.</w:t>
+      </w:r>
+    </w:p>
+    <w:p>
+      <w:pPr>
+        <w:numPr>
+          <w:ilvl w:val="0"/>
+          <w:numId w:val="36"/>
+        </w:numPr>
+        <w:tabs>
+          <w:tab w:val="left" w:pos="1200"/>
+        </w:tabs>
+        <w:spacing w:line="360" w:lineRule="auto"/>
+        <w:rPr>
+          <w:sz w:val="20"/>
+          <w:szCs w:val="20"/>
+          <w:lang w:val="es-MX"/>
+        </w:rPr>
+      </w:pPr>
+      <w:r>
+        <w:rPr>
+          <w:sz w:val="20"/>
+          <w:szCs w:val="20"/>
+          <w:lang w:val="es-MX"/>
+        </w:rPr>
+        <w:lastRenderedPageBreak/>
+        <w:t>Me percaté de que delegar la lógica de búsqueda a los procedimientos almacenados en SQL Server facilita mucho el trabajo en C#. Los filtros complejos (como buscar proveedores por nombre y ciudad o pedidos por fechas) se procesan directamente en el motor de base de datos, lo que hace que la aplicación de escritorio sea mucho más rápida y ligera.</w:t>
+      </w:r>
+    </w:p>
+    <w:p>
+      <w:pPr>
+        <w:numPr>
+          <w:ilvl w:val="0"/>
+          <w:numId w:val="36"/>
+        </w:numPr>
+        <w:tabs>
+          <w:tab w:val="left" w:pos="1200"/>
+        </w:tabs>
+        <w:spacing w:line="360" w:lineRule="auto"/>
+        <w:rPr>
+          <w:sz w:val="20"/>
+          <w:szCs w:val="20"/>
+          <w:lang w:val="es-MX"/>
+        </w:rPr>
+      </w:pPr>
+      <w:r>
+        <w:rPr>
+          <w:sz w:val="20"/>
+          <w:szCs w:val="20"/>
+          <w:lang w:val="es-MX"/>
+        </w:rPr>
+        <w:t>Al hacer pruebas borrando registros que ya tenían historial (como productos que ya estaban en pedidos antiguos), observé que la base de datos lanzaría errores de integridad referencial si intentaba hacer un borrado físico (DELETE), lo que me demostró lo fácil que es corromper un sistema en producción si no se planifica bien.</w:t>
+      </w:r>
+    </w:p>
+    <w:p>
+      <w:pPr>
+        <w:tabs>
+          <w:tab w:val="left" w:pos="1200"/>
+        </w:tabs>
+        <w:spacing w:line="360" w:lineRule="auto"/>
+        <w:rPr>
+          <w:sz w:val="20"/>
+          <w:szCs w:val="20"/>
+          <w:lang w:val="es-MX"/>
+        </w:rPr>
+      </w:pPr>
+      <w:r>
+        <w:rPr>
+          <w:sz w:val="20"/>
+          <w:szCs w:val="20"/>
+        </w:rPr>
+        <w:t>Conclusiones:</w:t>
+      </w:r>
+    </w:p>
+    <w:p>
+      <w:pPr>
+        <w:pStyle w:val="Prrafodelista"/>
+        <w:numPr>
+          <w:ilvl w:val="0"/>
+          <w:numId w:val="37"/>
+        </w:numPr>
+        <w:tabs>
+          <w:tab w:val="left" w:pos="1200"/>
+        </w:tabs>
+        <w:spacing w:line="360" w:lineRule="auto"/>
+        <w:rPr>
+          <w:sz w:val="20"/>
+          <w:szCs w:val="20"/>
+          <w:lang w:val="es-MX"/>
+        </w:rPr>
+      </w:pPr>
+      <w:r>
+        <w:rPr>
+          <w:sz w:val="20"/>
+          <w:szCs w:val="20"/>
+          <w:lang w:val="es-MX"/>
+        </w:rPr>
+        <w:t>Logré comprender e implementar exitosamente la técnica de "eliminación lógica" (</w:t>
+      </w:r>
+      <w:proofErr w:type="spellStart"/>
+      <w:r>
+        <w:rPr>
+          <w:sz w:val="20"/>
+          <w:szCs w:val="20"/>
+          <w:lang w:val="es-MX"/>
+        </w:rPr>
+        <w:t>Soft</w:t>
+      </w:r>
+      <w:proofErr w:type="spellEnd"/>
+      <w:r>
+        <w:rPr>
+          <w:sz w:val="20"/>
+          <w:szCs w:val="20"/>
+          <w:lang w:val="es-MX"/>
+        </w:rPr>
+        <w:t xml:space="preserve"> </w:t>
+      </w:r>
+      <w:proofErr w:type="spellStart"/>
+      <w:r>
+        <w:rPr>
+          <w:sz w:val="20"/>
+          <w:szCs w:val="20"/>
+          <w:lang w:val="es-MX"/>
+        </w:rPr>
+        <w:t>Delete</w:t>
+      </w:r>
+      <w:proofErr w:type="spellEnd"/>
+      <w:r>
+        <w:rPr>
+          <w:sz w:val="20"/>
+          <w:szCs w:val="20"/>
+          <w:lang w:val="es-MX"/>
+        </w:rPr>
+        <w:t>). Concluyo que simplemente utilizando un campo Activo tipo BIT podemos ocultar los registros para el usuario final sin destruir el valioso historial de ventas de la empresa.</w:t>
+      </w:r>
+    </w:p>
+    <w:p>
+      <w:pPr>
+        <w:pStyle w:val="Prrafodelista"/>
+        <w:numPr>
+          <w:ilvl w:val="0"/>
+          <w:numId w:val="37"/>
+        </w:numPr>
+        <w:tabs>
+          <w:tab w:val="left" w:pos="1200"/>
+        </w:tabs>
+        <w:spacing w:line="360" w:lineRule="auto"/>
+        <w:rPr>
+          <w:sz w:val="20"/>
+          <w:szCs w:val="20"/>
+          <w:lang w:val="es-MX"/>
+        </w:rPr>
+      </w:pPr>
+      <w:r>
+        <w:rPr>
+          <w:sz w:val="20"/>
+          <w:szCs w:val="20"/>
+          <w:lang w:val="es-MX"/>
+        </w:rPr>
+        <w:t xml:space="preserve">Comprobé que el método </w:t>
+      </w:r>
+      <w:proofErr w:type="spellStart"/>
+      <w:proofErr w:type="gramStart"/>
+      <w:r>
+        <w:rPr>
+          <w:sz w:val="20"/>
+          <w:szCs w:val="20"/>
+          <w:lang w:val="es-MX"/>
+        </w:rPr>
+        <w:t>ExecuteNonQuery</w:t>
+      </w:r>
+      <w:proofErr w:type="spellEnd"/>
+      <w:r>
+        <w:rPr>
+          <w:sz w:val="20"/>
+          <w:szCs w:val="20"/>
+          <w:lang w:val="es-MX"/>
+        </w:rPr>
+        <w:t>(</w:t>
+      </w:r>
+      <w:proofErr w:type="gramEnd"/>
+      <w:r>
+        <w:rPr>
+          <w:sz w:val="20"/>
+          <w:szCs w:val="20"/>
+          <w:lang w:val="es-MX"/>
+        </w:rPr>
+        <w:t>) de ADO.NET es la herramienta más adecuada y eficiente para las operaciones transaccionales de escritura (Alta, Baja, Modificación), ya que ejecuta las instrucciones en la base de datos de forma segura y solo nos devuelve el número de filas afectadas para confirmar la operación.</w:t>
+      </w:r>
+    </w:p>
+    <w:p>
+      <w:pPr>
+        <w:pStyle w:val="Prrafodelista"/>
+        <w:numPr>
+          <w:ilvl w:val="0"/>
+          <w:numId w:val="37"/>
+        </w:numPr>
+        <w:tabs>
+          <w:tab w:val="left" w:pos="1200"/>
+        </w:tabs>
+        <w:spacing w:line="360" w:lineRule="auto"/>
+        <w:rPr>
+          <w:sz w:val="20"/>
+          <w:szCs w:val="20"/>
+          <w:lang w:val="es-MX"/>
+        </w:rPr>
+      </w:pPr>
+      <w:r>
+        <w:rPr>
+          <w:sz w:val="20"/>
+          <w:szCs w:val="20"/>
+          <w:lang w:val="es-MX"/>
+        </w:rPr>
+        <w:t>El patrón MVVM demostró ser fundamental para organizar el código. Concluyo que separar la Vista (XAML) del Modelo de Vista (C#) me permite rediseñar por completo la interfaz visual de la aplicación (como agregar el menú lateral colapsable) sin ningún riesgo de romper la conexión a los datos.</w:t>
+      </w:r>
+    </w:p>
+    <w:p>
+      <w:pPr>
+        <w:pStyle w:val="Prrafodelista"/>
+        <w:numPr>
+          <w:ilvl w:val="0"/>
+          <w:numId w:val="37"/>
+        </w:numPr>
+        <w:tabs>
+          <w:tab w:val="left" w:pos="1200"/>
+        </w:tabs>
+        <w:spacing w:line="360" w:lineRule="auto"/>
+        <w:rPr>
+          <w:sz w:val="20"/>
+          <w:szCs w:val="20"/>
+          <w:lang w:val="es-MX"/>
+        </w:rPr>
+      </w:pPr>
+      <w:r>
+        <w:rPr>
+          <w:sz w:val="20"/>
+          <w:szCs w:val="20"/>
+          <w:lang w:val="es-MX"/>
+        </w:rPr>
+        <w:t xml:space="preserve">Finalmente, concluyo que la integración de C#, WPF y SQL Server sigue siendo una pila tecnológica extremadamente robusta para construir sistemas empresariales. </w:t>
       </w:r>
     </w:p>
     <w:sectPr>
@@ -1774,6 +3170,119 @@
     </w:lvl>
   </w:abstractNum>
   <w:abstractNum w:abstractNumId="2" w15:restartNumberingAfterBreak="0">
+    <w:nsid w:val="08A5606A"/>
+    <w:multiLevelType w:val="multilevel"/>
+    <w:tmpl w:val="14EA9F9C"/>
+    <w:lvl w:ilvl="0">
+      <w:start w:val="1"/>
+      <w:numFmt w:val="decimal"/>
+      <w:lvlText w:val="%1."/>
+      <w:lvlJc w:val="left"/>
+      <w:pPr>
+        <w:tabs>
+          <w:tab w:val="num" w:pos="720"/>
+        </w:tabs>
+        <w:ind w:left="720" w:hanging="360"/>
+      </w:pPr>
+    </w:lvl>
+    <w:lvl w:ilvl="1" w:tentative="1">
+      <w:start w:val="1"/>
+      <w:numFmt w:val="decimal"/>
+      <w:lvlText w:val="%2."/>
+      <w:lvlJc w:val="left"/>
+      <w:pPr>
+        <w:tabs>
+          <w:tab w:val="num" w:pos="1440"/>
+        </w:tabs>
+        <w:ind w:left="1440" w:hanging="360"/>
+      </w:pPr>
+    </w:lvl>
+    <w:lvl w:ilvl="2" w:tentative="1">
+      <w:start w:val="1"/>
+      <w:numFmt w:val="decimal"/>
+      <w:lvlText w:val="%3."/>
+      <w:lvlJc w:val="left"/>
+      <w:pPr>
+        <w:tabs>
+          <w:tab w:val="num" w:pos="2160"/>
+        </w:tabs>
+        <w:ind w:left="2160" w:hanging="360"/>
+      </w:pPr>
+    </w:lvl>
+    <w:lvl w:ilvl="3" w:tentative="1">
+      <w:start w:val="1"/>
+      <w:numFmt w:val="decimal"/>
+      <w:lvlText w:val="%4."/>
+      <w:lvlJc w:val="left"/>
+      <w:pPr>
+        <w:tabs>
+          <w:tab w:val="num" w:pos="2880"/>
+        </w:tabs>
+        <w:ind w:left="2880" w:hanging="360"/>
+      </w:pPr>
+    </w:lvl>
+    <w:lvl w:ilvl="4" w:tentative="1">
+      <w:start w:val="1"/>
+      <w:numFmt w:val="decimal"/>
+      <w:lvlText w:val="%5."/>
+      <w:lvlJc w:val="left"/>
+      <w:pPr>
+        <w:tabs>
+          <w:tab w:val="num" w:pos="3600"/>
+        </w:tabs>
+        <w:ind w:left="3600" w:hanging="360"/>
+      </w:pPr>
+    </w:lvl>
+    <w:lvl w:ilvl="5" w:tentative="1">
+      <w:start w:val="1"/>
+      <w:numFmt w:val="decimal"/>
+      <w:lvlText w:val="%6."/>
+      <w:lvlJc w:val="left"/>
+      <w:pPr>
+        <w:tabs>
+          <w:tab w:val="num" w:pos="4320"/>
+        </w:tabs>
+        <w:ind w:left="4320" w:hanging="360"/>
+      </w:pPr>
+    </w:lvl>
+    <w:lvl w:ilvl="6" w:tentative="1">
+      <w:start w:val="1"/>
+      <w:numFmt w:val="decimal"/>
+      <w:lvlText w:val="%7."/>
+      <w:lvlJc w:val="left"/>
+      <w:pPr>
+        <w:tabs>
+          <w:tab w:val="num" w:pos="5040"/>
+        </w:tabs>
+        <w:ind w:left="5040" w:hanging="360"/>
+      </w:pPr>
+    </w:lvl>
+    <w:lvl w:ilvl="7" w:tentative="1">
+      <w:start w:val="1"/>
+      <w:numFmt w:val="decimal"/>
+      <w:lvlText w:val="%8."/>
+      <w:lvlJc w:val="left"/>
+      <w:pPr>
+        <w:tabs>
+          <w:tab w:val="num" w:pos="5760"/>
+        </w:tabs>
+        <w:ind w:left="5760" w:hanging="360"/>
+      </w:pPr>
+    </w:lvl>
+    <w:lvl w:ilvl="8" w:tentative="1">
+      <w:start w:val="1"/>
+      <w:numFmt w:val="decimal"/>
+      <w:lvlText w:val="%9."/>
+      <w:lvlJc w:val="left"/>
+      <w:pPr>
+        <w:tabs>
+          <w:tab w:val="num" w:pos="6480"/>
+        </w:tabs>
+        <w:ind w:left="6480" w:hanging="360"/>
+      </w:pPr>
+    </w:lvl>
+  </w:abstractNum>
+  <w:abstractNum w:abstractNumId="3" w15:restartNumberingAfterBreak="0">
     <w:nsid w:val="0FBE1D16"/>
     <w:multiLevelType w:val="hybridMultilevel"/>
     <w:tmpl w:val="1C5097D8"/>
@@ -1862,7 +3371,7 @@
       </w:pPr>
     </w:lvl>
   </w:abstractNum>
-  <w:abstractNum w:abstractNumId="3" w15:restartNumberingAfterBreak="0">
+  <w:abstractNum w:abstractNumId="4" w15:restartNumberingAfterBreak="0">
     <w:nsid w:val="107337A8"/>
     <w:multiLevelType w:val="multilevel"/>
     <w:tmpl w:val="D450985C"/>
@@ -1975,7 +3484,7 @@
       </w:pPr>
     </w:lvl>
   </w:abstractNum>
-  <w:abstractNum w:abstractNumId="4" w15:restartNumberingAfterBreak="0">
+  <w:abstractNum w:abstractNumId="5" w15:restartNumberingAfterBreak="0">
     <w:nsid w:val="115C36C1"/>
     <w:multiLevelType w:val="hybridMultilevel"/>
     <w:tmpl w:val="791E0CA8"/>
@@ -2061,7 +3570,7 @@
       </w:pPr>
     </w:lvl>
   </w:abstractNum>
-  <w:abstractNum w:abstractNumId="5" w15:restartNumberingAfterBreak="0">
+  <w:abstractNum w:abstractNumId="6" w15:restartNumberingAfterBreak="0">
     <w:nsid w:val="127707A0"/>
     <w:multiLevelType w:val="multilevel"/>
     <w:tmpl w:val="99049BE4"/>
@@ -2147,7 +3656,93 @@
       </w:pPr>
     </w:lvl>
   </w:abstractNum>
-  <w:abstractNum w:abstractNumId="6" w15:restartNumberingAfterBreak="0">
+  <w:abstractNum w:abstractNumId="7" w15:restartNumberingAfterBreak="0">
+    <w:nsid w:val="18540325"/>
+    <w:multiLevelType w:val="hybridMultilevel"/>
+    <w:tmpl w:val="A5460BA6"/>
+    <w:lvl w:ilvl="0" w:tplc="0409000F">
+      <w:start w:val="1"/>
+      <w:numFmt w:val="decimal"/>
+      <w:lvlText w:val="%1."/>
+      <w:lvlJc w:val="left"/>
+      <w:pPr>
+        <w:ind w:left="720" w:hanging="360"/>
+      </w:pPr>
+    </w:lvl>
+    <w:lvl w:ilvl="1" w:tplc="04090019" w:tentative="1">
+      <w:start w:val="1"/>
+      <w:numFmt w:val="lowerLetter"/>
+      <w:lvlText w:val="%2."/>
+      <w:lvlJc w:val="left"/>
+      <w:pPr>
+        <w:ind w:left="1440" w:hanging="360"/>
+      </w:pPr>
+    </w:lvl>
+    <w:lvl w:ilvl="2" w:tplc="0409001B" w:tentative="1">
+      <w:start w:val="1"/>
+      <w:numFmt w:val="lowerRoman"/>
+      <w:lvlText w:val="%3."/>
+      <w:lvlJc w:val="right"/>
+      <w:pPr>
+        <w:ind w:left="2160" w:hanging="180"/>
+      </w:pPr>
+    </w:lvl>
+    <w:lvl w:ilvl="3" w:tplc="0409000F" w:tentative="1">
+      <w:start w:val="1"/>
+      <w:numFmt w:val="decimal"/>
+      <w:lvlText w:val="%4."/>
+      <w:lvlJc w:val="left"/>
+      <w:pPr>
+        <w:ind w:left="2880" w:hanging="360"/>
+      </w:pPr>
+    </w:lvl>
+    <w:lvl w:ilvl="4" w:tplc="04090019" w:tentative="1">
+      <w:start w:val="1"/>
+      <w:numFmt w:val="lowerLetter"/>
+      <w:lvlText w:val="%5."/>
+      <w:lvlJc w:val="left"/>
+      <w:pPr>
+        <w:ind w:left="3600" w:hanging="360"/>
+      </w:pPr>
+    </w:lvl>
+    <w:lvl w:ilvl="5" w:tplc="0409001B" w:tentative="1">
+      <w:start w:val="1"/>
+      <w:numFmt w:val="lowerRoman"/>
+      <w:lvlText w:val="%6."/>
+      <w:lvlJc w:val="right"/>
+      <w:pPr>
+        <w:ind w:left="4320" w:hanging="180"/>
+      </w:pPr>
+    </w:lvl>
+    <w:lvl w:ilvl="6" w:tplc="0409000F" w:tentative="1">
+      <w:start w:val="1"/>
+      <w:numFmt w:val="decimal"/>
+      <w:lvlText w:val="%7."/>
+      <w:lvlJc w:val="left"/>
+      <w:pPr>
+        <w:ind w:left="5040" w:hanging="360"/>
+      </w:pPr>
+    </w:lvl>
+    <w:lvl w:ilvl="7" w:tplc="04090019" w:tentative="1">
+      <w:start w:val="1"/>
+      <w:numFmt w:val="lowerLetter"/>
+      <w:lvlText w:val="%8."/>
+      <w:lvlJc w:val="left"/>
+      <w:pPr>
+        <w:ind w:left="5760" w:hanging="360"/>
+      </w:pPr>
+    </w:lvl>
+    <w:lvl w:ilvl="8" w:tplc="0409001B" w:tentative="1">
+      <w:start w:val="1"/>
+      <w:numFmt w:val="lowerRoman"/>
+      <w:lvlText w:val="%9."/>
+      <w:lvlJc w:val="right"/>
+      <w:pPr>
+        <w:ind w:left="6480" w:hanging="180"/>
+      </w:pPr>
+    </w:lvl>
+  </w:abstractNum>
+  <w:abstractNum w:abstractNumId="8" w15:restartNumberingAfterBreak="0">
     <w:nsid w:val="18595554"/>
     <w:multiLevelType w:val="multilevel"/>
     <w:tmpl w:val="7E7A89E6"/>
@@ -2260,7 +3855,7 @@
       </w:pPr>
     </w:lvl>
   </w:abstractNum>
-  <w:abstractNum w:abstractNumId="7" w15:restartNumberingAfterBreak="0">
+  <w:abstractNum w:abstractNumId="9" w15:restartNumberingAfterBreak="0">
     <w:nsid w:val="1A057790"/>
     <w:multiLevelType w:val="multilevel"/>
     <w:tmpl w:val="642C65C2"/>
@@ -2373,7 +3968,7 @@
       </w:pPr>
     </w:lvl>
   </w:abstractNum>
-  <w:abstractNum w:abstractNumId="8" w15:restartNumberingAfterBreak="0">
+  <w:abstractNum w:abstractNumId="10" w15:restartNumberingAfterBreak="0">
     <w:nsid w:val="1B442969"/>
     <w:multiLevelType w:val="hybridMultilevel"/>
     <w:tmpl w:val="85908684"/>
@@ -2462,7 +4057,7 @@
       </w:pPr>
     </w:lvl>
   </w:abstractNum>
-  <w:abstractNum w:abstractNumId="9" w15:restartNumberingAfterBreak="0">
+  <w:abstractNum w:abstractNumId="11" w15:restartNumberingAfterBreak="0">
     <w:nsid w:val="1D835387"/>
     <w:multiLevelType w:val="multilevel"/>
     <w:tmpl w:val="4252CC7E"/>
@@ -2575,7 +4170,7 @@
       </w:pPr>
     </w:lvl>
   </w:abstractNum>
-  <w:abstractNum w:abstractNumId="10" w15:restartNumberingAfterBreak="0">
+  <w:abstractNum w:abstractNumId="12" w15:restartNumberingAfterBreak="0">
     <w:nsid w:val="1DCC4492"/>
     <w:multiLevelType w:val="multilevel"/>
     <w:tmpl w:val="8A44C9CC"/>
@@ -2661,7 +4256,7 @@
       </w:pPr>
     </w:lvl>
   </w:abstractNum>
-  <w:abstractNum w:abstractNumId="11" w15:restartNumberingAfterBreak="0">
+  <w:abstractNum w:abstractNumId="13" w15:restartNumberingAfterBreak="0">
     <w:nsid w:val="1E8B6B13"/>
     <w:multiLevelType w:val="multilevel"/>
     <w:tmpl w:val="EB84C398"/>
@@ -2774,7 +4369,7 @@
       </w:pPr>
     </w:lvl>
   </w:abstractNum>
-  <w:abstractNum w:abstractNumId="12" w15:restartNumberingAfterBreak="0">
+  <w:abstractNum w:abstractNumId="14" w15:restartNumberingAfterBreak="0">
     <w:nsid w:val="2BF0532A"/>
     <w:multiLevelType w:val="multilevel"/>
     <w:tmpl w:val="280A001D"/>
@@ -2860,7 +4455,7 @@
       </w:pPr>
     </w:lvl>
   </w:abstractNum>
-  <w:abstractNum w:abstractNumId="13" w15:restartNumberingAfterBreak="0">
+  <w:abstractNum w:abstractNumId="15" w15:restartNumberingAfterBreak="0">
     <w:nsid w:val="2E12165D"/>
     <w:multiLevelType w:val="hybridMultilevel"/>
     <w:tmpl w:val="10BC6260"/>
@@ -2946,7 +4541,7 @@
       </w:pPr>
     </w:lvl>
   </w:abstractNum>
-  <w:abstractNum w:abstractNumId="14" w15:restartNumberingAfterBreak="0">
+  <w:abstractNum w:abstractNumId="16" w15:restartNumberingAfterBreak="0">
     <w:nsid w:val="30D06465"/>
     <w:multiLevelType w:val="multilevel"/>
     <w:tmpl w:val="96C814A2"/>
@@ -3059,7 +4654,7 @@
       </w:pPr>
     </w:lvl>
   </w:abstractNum>
-  <w:abstractNum w:abstractNumId="15" w15:restartNumberingAfterBreak="0">
+  <w:abstractNum w:abstractNumId="17" w15:restartNumberingAfterBreak="0">
     <w:nsid w:val="35AD5A72"/>
     <w:multiLevelType w:val="multilevel"/>
     <w:tmpl w:val="E182BCC2"/>
@@ -3145,7 +4740,7 @@
       </w:pPr>
     </w:lvl>
   </w:abstractNum>
-  <w:abstractNum w:abstractNumId="16" w15:restartNumberingAfterBreak="0">
+  <w:abstractNum w:abstractNumId="18" w15:restartNumberingAfterBreak="0">
     <w:nsid w:val="37586FC5"/>
     <w:multiLevelType w:val="multilevel"/>
     <w:tmpl w:val="4F2484D6"/>
@@ -3258,7 +4853,7 @@
       </w:pPr>
     </w:lvl>
   </w:abstractNum>
-  <w:abstractNum w:abstractNumId="17" w15:restartNumberingAfterBreak="0">
+  <w:abstractNum w:abstractNumId="19" w15:restartNumberingAfterBreak="0">
     <w:nsid w:val="39023E19"/>
     <w:multiLevelType w:val="multilevel"/>
     <w:tmpl w:val="E6807EA0"/>
@@ -3371,7 +4966,120 @@
       </w:pPr>
     </w:lvl>
   </w:abstractNum>
-  <w:abstractNum w:abstractNumId="18" w15:restartNumberingAfterBreak="0">
+  <w:abstractNum w:abstractNumId="20" w15:restartNumberingAfterBreak="0">
+    <w:nsid w:val="39577AB3"/>
+    <w:multiLevelType w:val="multilevel"/>
+    <w:tmpl w:val="DA34B104"/>
+    <w:lvl w:ilvl="0">
+      <w:start w:val="1"/>
+      <w:numFmt w:val="decimal"/>
+      <w:lvlText w:val="%1."/>
+      <w:lvlJc w:val="left"/>
+      <w:pPr>
+        <w:tabs>
+          <w:tab w:val="num" w:pos="720"/>
+        </w:tabs>
+        <w:ind w:left="720" w:hanging="360"/>
+      </w:pPr>
+    </w:lvl>
+    <w:lvl w:ilvl="1" w:tentative="1">
+      <w:start w:val="1"/>
+      <w:numFmt w:val="decimal"/>
+      <w:lvlText w:val="%2."/>
+      <w:lvlJc w:val="left"/>
+      <w:pPr>
+        <w:tabs>
+          <w:tab w:val="num" w:pos="1440"/>
+        </w:tabs>
+        <w:ind w:left="1440" w:hanging="360"/>
+      </w:pPr>
+    </w:lvl>
+    <w:lvl w:ilvl="2" w:tentative="1">
+      <w:start w:val="1"/>
+      <w:numFmt w:val="decimal"/>
+      <w:lvlText w:val="%3."/>
+      <w:lvlJc w:val="left"/>
+      <w:pPr>
+        <w:tabs>
+          <w:tab w:val="num" w:pos="2160"/>
+        </w:tabs>
+        <w:ind w:left="2160" w:hanging="360"/>
+      </w:pPr>
+    </w:lvl>
+    <w:lvl w:ilvl="3" w:tentative="1">
+      <w:start w:val="1"/>
+      <w:numFmt w:val="decimal"/>
+      <w:lvlText w:val="%4."/>
+      <w:lvlJc w:val="left"/>
+      <w:pPr>
+        <w:tabs>
+          <w:tab w:val="num" w:pos="2880"/>
+        </w:tabs>
+        <w:ind w:left="2880" w:hanging="360"/>
+      </w:pPr>
+    </w:lvl>
+    <w:lvl w:ilvl="4" w:tentative="1">
+      <w:start w:val="1"/>
+      <w:numFmt w:val="decimal"/>
+      <w:lvlText w:val="%5."/>
+      <w:lvlJc w:val="left"/>
+      <w:pPr>
+        <w:tabs>
+          <w:tab w:val="num" w:pos="3600"/>
+        </w:tabs>
+        <w:ind w:left="3600" w:hanging="360"/>
+      </w:pPr>
+    </w:lvl>
+    <w:lvl w:ilvl="5" w:tentative="1">
+      <w:start w:val="1"/>
+      <w:numFmt w:val="decimal"/>
+      <w:lvlText w:val="%6."/>
+      <w:lvlJc w:val="left"/>
+      <w:pPr>
+        <w:tabs>
+          <w:tab w:val="num" w:pos="4320"/>
+        </w:tabs>
+        <w:ind w:left="4320" w:hanging="360"/>
+      </w:pPr>
+    </w:lvl>
+    <w:lvl w:ilvl="6" w:tentative="1">
+      <w:start w:val="1"/>
+      <w:numFmt w:val="decimal"/>
+      <w:lvlText w:val="%7."/>
+      <w:lvlJc w:val="left"/>
+      <w:pPr>
+        <w:tabs>
+          <w:tab w:val="num" w:pos="5040"/>
+        </w:tabs>
+        <w:ind w:left="5040" w:hanging="360"/>
+      </w:pPr>
+    </w:lvl>
+    <w:lvl w:ilvl="7" w:tentative="1">
+      <w:start w:val="1"/>
+      <w:numFmt w:val="decimal"/>
+      <w:lvlText w:val="%8."/>
+      <w:lvlJc w:val="left"/>
+      <w:pPr>
+        <w:tabs>
+          <w:tab w:val="num" w:pos="5760"/>
+        </w:tabs>
+        <w:ind w:left="5760" w:hanging="360"/>
+      </w:pPr>
+    </w:lvl>
+    <w:lvl w:ilvl="8" w:tentative="1">
+      <w:start w:val="1"/>
+      <w:numFmt w:val="decimal"/>
+      <w:lvlText w:val="%9."/>
+      <w:lvlJc w:val="left"/>
+      <w:pPr>
+        <w:tabs>
+          <w:tab w:val="num" w:pos="6480"/>
+        </w:tabs>
+        <w:ind w:left="6480" w:hanging="360"/>
+      </w:pPr>
+    </w:lvl>
+  </w:abstractNum>
+  <w:abstractNum w:abstractNumId="21" w15:restartNumberingAfterBreak="0">
     <w:nsid w:val="3CCD47B7"/>
     <w:multiLevelType w:val="hybridMultilevel"/>
     <w:tmpl w:val="2424E8BC"/>
@@ -3484,7 +5192,7 @@
       </w:rPr>
     </w:lvl>
   </w:abstractNum>
-  <w:abstractNum w:abstractNumId="19" w15:restartNumberingAfterBreak="0">
+  <w:abstractNum w:abstractNumId="22" w15:restartNumberingAfterBreak="0">
     <w:nsid w:val="3E713726"/>
     <w:multiLevelType w:val="hybridMultilevel"/>
     <w:tmpl w:val="8C6470C6"/>
@@ -3573,7 +5281,7 @@
       </w:pPr>
     </w:lvl>
   </w:abstractNum>
-  <w:abstractNum w:abstractNumId="20" w15:restartNumberingAfterBreak="0">
+  <w:abstractNum w:abstractNumId="23" w15:restartNumberingAfterBreak="0">
     <w:nsid w:val="47F552D5"/>
     <w:multiLevelType w:val="hybridMultilevel"/>
     <w:tmpl w:val="7BF6F7A8"/>
@@ -3659,7 +5367,7 @@
       </w:pPr>
     </w:lvl>
   </w:abstractNum>
-  <w:abstractNum w:abstractNumId="21" w15:restartNumberingAfterBreak="0">
+  <w:abstractNum w:abstractNumId="24" w15:restartNumberingAfterBreak="0">
     <w:nsid w:val="482742F4"/>
     <w:multiLevelType w:val="multilevel"/>
     <w:tmpl w:val="B19E9C8C"/>
@@ -3772,7 +5480,7 @@
       </w:pPr>
     </w:lvl>
   </w:abstractNum>
-  <w:abstractNum w:abstractNumId="22" w15:restartNumberingAfterBreak="0">
+  <w:abstractNum w:abstractNumId="25" w15:restartNumberingAfterBreak="0">
     <w:nsid w:val="5074364B"/>
     <w:multiLevelType w:val="hybridMultilevel"/>
     <w:tmpl w:val="035E9EA0"/>
@@ -3885,7 +5593,7 @@
       </w:rPr>
     </w:lvl>
   </w:abstractNum>
-  <w:abstractNum w:abstractNumId="23" w15:restartNumberingAfterBreak="0">
+  <w:abstractNum w:abstractNumId="26" w15:restartNumberingAfterBreak="0">
     <w:nsid w:val="53650835"/>
     <w:multiLevelType w:val="multilevel"/>
     <w:tmpl w:val="0FE8A092"/>
@@ -3998,7 +5706,7 @@
       </w:pPr>
     </w:lvl>
   </w:abstractNum>
-  <w:abstractNum w:abstractNumId="24" w15:restartNumberingAfterBreak="0">
+  <w:abstractNum w:abstractNumId="27" w15:restartNumberingAfterBreak="0">
     <w:nsid w:val="58395AE4"/>
     <w:multiLevelType w:val="multilevel"/>
     <w:tmpl w:val="565C9BBA"/>
@@ -4111,7 +5819,7 @@
       </w:pPr>
     </w:lvl>
   </w:abstractNum>
-  <w:abstractNum w:abstractNumId="25" w15:restartNumberingAfterBreak="0">
+  <w:abstractNum w:abstractNumId="28" w15:restartNumberingAfterBreak="0">
     <w:nsid w:val="5A80326E"/>
     <w:multiLevelType w:val="multilevel"/>
     <w:tmpl w:val="B26A4080"/>
@@ -4224,7 +5932,7 @@
       </w:pPr>
     </w:lvl>
   </w:abstractNum>
-  <w:abstractNum w:abstractNumId="26" w15:restartNumberingAfterBreak="0">
+  <w:abstractNum w:abstractNumId="29" w15:restartNumberingAfterBreak="0">
     <w:nsid w:val="65315621"/>
     <w:multiLevelType w:val="hybridMultilevel"/>
     <w:tmpl w:val="FAEA73EA"/>
@@ -4337,7 +6045,7 @@
       </w:rPr>
     </w:lvl>
   </w:abstractNum>
-  <w:abstractNum w:abstractNumId="27" w15:restartNumberingAfterBreak="0">
+  <w:abstractNum w:abstractNumId="30" w15:restartNumberingAfterBreak="0">
     <w:nsid w:val="659D100C"/>
     <w:multiLevelType w:val="multilevel"/>
     <w:tmpl w:val="C526E54A"/>
@@ -4486,7 +6194,7 @@
       </w:rPr>
     </w:lvl>
   </w:abstractNum>
-  <w:abstractNum w:abstractNumId="28" w15:restartNumberingAfterBreak="0">
+  <w:abstractNum w:abstractNumId="31" w15:restartNumberingAfterBreak="0">
     <w:nsid w:val="68C940AC"/>
     <w:multiLevelType w:val="multilevel"/>
     <w:tmpl w:val="B23C38E6"/>
@@ -4599,7 +6307,7 @@
       </w:pPr>
     </w:lvl>
   </w:abstractNum>
-  <w:abstractNum w:abstractNumId="29" w15:restartNumberingAfterBreak="0">
+  <w:abstractNum w:abstractNumId="32" w15:restartNumberingAfterBreak="0">
     <w:nsid w:val="6A784CAE"/>
     <w:multiLevelType w:val="hybridMultilevel"/>
     <w:tmpl w:val="E182BCC2"/>
@@ -4685,7 +6393,7 @@
       </w:pPr>
     </w:lvl>
   </w:abstractNum>
-  <w:abstractNum w:abstractNumId="30" w15:restartNumberingAfterBreak="0">
+  <w:abstractNum w:abstractNumId="33" w15:restartNumberingAfterBreak="0">
     <w:nsid w:val="70C45546"/>
     <w:multiLevelType w:val="multilevel"/>
     <w:tmpl w:val="596E2768"/>
@@ -4798,7 +6506,7 @@
       </w:pPr>
     </w:lvl>
   </w:abstractNum>
-  <w:abstractNum w:abstractNumId="31" w15:restartNumberingAfterBreak="0">
+  <w:abstractNum w:abstractNumId="34" w15:restartNumberingAfterBreak="0">
     <w:nsid w:val="73DF10D2"/>
     <w:multiLevelType w:val="hybridMultilevel"/>
     <w:tmpl w:val="6C521A8E"/>
@@ -4911,7 +6619,7 @@
       </w:rPr>
     </w:lvl>
   </w:abstractNum>
-  <w:abstractNum w:abstractNumId="32" w15:restartNumberingAfterBreak="0">
+  <w:abstractNum w:abstractNumId="35" w15:restartNumberingAfterBreak="0">
     <w:nsid w:val="78E37B27"/>
     <w:multiLevelType w:val="multilevel"/>
     <w:tmpl w:val="A80A1EAC"/>
@@ -5024,7 +6732,7 @@
       </w:pPr>
     </w:lvl>
   </w:abstractNum>
-  <w:abstractNum w:abstractNumId="33" w15:restartNumberingAfterBreak="0">
+  <w:abstractNum w:abstractNumId="36" w15:restartNumberingAfterBreak="0">
     <w:nsid w:val="7A7647D8"/>
     <w:multiLevelType w:val="multilevel"/>
     <w:tmpl w:val="F24C179C"/>
@@ -5138,49 +6846,49 @@
     </w:lvl>
   </w:abstractNum>
   <w:num w:numId="1" w16cid:durableId="1112627851">
-    <w:abstractNumId w:val="26"/>
+    <w:abstractNumId w:val="29"/>
   </w:num>
   <w:num w:numId="2" w16cid:durableId="1559972025">
-    <w:abstractNumId w:val="8"/>
+    <w:abstractNumId w:val="10"/>
   </w:num>
   <w:num w:numId="3" w16cid:durableId="1655136106">
-    <w:abstractNumId w:val="18"/>
+    <w:abstractNumId w:val="21"/>
   </w:num>
   <w:num w:numId="4" w16cid:durableId="1548253119">
-    <w:abstractNumId w:val="31"/>
+    <w:abstractNumId w:val="34"/>
   </w:num>
   <w:num w:numId="5" w16cid:durableId="789515762">
-    <w:abstractNumId w:val="29"/>
+    <w:abstractNumId w:val="32"/>
   </w:num>
   <w:num w:numId="6" w16cid:durableId="739713673">
-    <w:abstractNumId w:val="12"/>
+    <w:abstractNumId w:val="14"/>
   </w:num>
   <w:num w:numId="7" w16cid:durableId="1453867105">
+    <w:abstractNumId w:val="17"/>
+  </w:num>
+  <w:num w:numId="8" w16cid:durableId="603655264">
+    <w:abstractNumId w:val="25"/>
+  </w:num>
+  <w:num w:numId="9" w16cid:durableId="1523671169">
+    <w:abstractNumId w:val="5"/>
+  </w:num>
+  <w:num w:numId="10" w16cid:durableId="1665474198">
+    <w:abstractNumId w:val="22"/>
+  </w:num>
+  <w:num w:numId="11" w16cid:durableId="2135633800">
+    <w:abstractNumId w:val="30"/>
+  </w:num>
+  <w:num w:numId="12" w16cid:durableId="17196005">
+    <w:abstractNumId w:val="3"/>
+  </w:num>
+  <w:num w:numId="13" w16cid:durableId="1168524751">
+    <w:abstractNumId w:val="23"/>
+  </w:num>
+  <w:num w:numId="14" w16cid:durableId="889807549">
     <w:abstractNumId w:val="15"/>
   </w:num>
-  <w:num w:numId="8" w16cid:durableId="603655264">
-    <w:abstractNumId w:val="22"/>
-  </w:num>
-  <w:num w:numId="9" w16cid:durableId="1523671169">
-    <w:abstractNumId w:val="4"/>
-  </w:num>
-  <w:num w:numId="10" w16cid:durableId="1665474198">
-    <w:abstractNumId w:val="19"/>
-  </w:num>
-  <w:num w:numId="11" w16cid:durableId="2135633800">
-    <w:abstractNumId w:val="27"/>
-  </w:num>
-  <w:num w:numId="12" w16cid:durableId="17196005">
-    <w:abstractNumId w:val="2"/>
-  </w:num>
-  <w:num w:numId="13" w16cid:durableId="1168524751">
-    <w:abstractNumId w:val="20"/>
-  </w:num>
-  <w:num w:numId="14" w16cid:durableId="889807549">
-    <w:abstractNumId w:val="13"/>
-  </w:num>
   <w:num w:numId="15" w16cid:durableId="287862809">
-    <w:abstractNumId w:val="5"/>
+    <w:abstractNumId w:val="6"/>
     <w:lvlOverride w:ilvl="0">
       <w:startOverride w:val="1"/>
     </w:lvlOverride>
@@ -5210,61 +6918,70 @@
     </w:lvlOverride>
   </w:num>
   <w:num w:numId="16" w16cid:durableId="492571494">
+    <w:abstractNumId w:val="36"/>
+  </w:num>
+  <w:num w:numId="17" w16cid:durableId="291012443">
+    <w:abstractNumId w:val="31"/>
+  </w:num>
+  <w:num w:numId="18" w16cid:durableId="1057969942">
+    <w:abstractNumId w:val="4"/>
+  </w:num>
+  <w:num w:numId="19" w16cid:durableId="639312882">
+    <w:abstractNumId w:val="13"/>
+  </w:num>
+  <w:num w:numId="20" w16cid:durableId="917637524">
+    <w:abstractNumId w:val="18"/>
+  </w:num>
+  <w:num w:numId="21" w16cid:durableId="145324473">
+    <w:abstractNumId w:val="24"/>
+  </w:num>
+  <w:num w:numId="22" w16cid:durableId="393772878">
     <w:abstractNumId w:val="33"/>
   </w:num>
-  <w:num w:numId="17" w16cid:durableId="291012443">
-    <w:abstractNumId w:val="28"/>
+  <w:num w:numId="23" w16cid:durableId="2044745370">
+    <w:abstractNumId w:val="16"/>
   </w:num>
-  <w:num w:numId="18" w16cid:durableId="1057969942">
-    <w:abstractNumId w:val="3"/>
+  <w:num w:numId="24" w16cid:durableId="487212011">
+    <w:abstractNumId w:val="9"/>
   </w:num>
-  <w:num w:numId="19" w16cid:durableId="639312882">
+  <w:num w:numId="25" w16cid:durableId="1727491516">
+    <w:abstractNumId w:val="27"/>
+  </w:num>
+  <w:num w:numId="26" w16cid:durableId="1568299721">
+    <w:abstractNumId w:val="8"/>
+  </w:num>
+  <w:num w:numId="27" w16cid:durableId="1249119854">
     <w:abstractNumId w:val="11"/>
   </w:num>
-  <w:num w:numId="20" w16cid:durableId="917637524">
-    <w:abstractNumId w:val="16"/>
-  </w:num>
-  <w:num w:numId="21" w16cid:durableId="145324473">
-    <w:abstractNumId w:val="21"/>
-  </w:num>
-  <w:num w:numId="22" w16cid:durableId="393772878">
-    <w:abstractNumId w:val="30"/>
-  </w:num>
-  <w:num w:numId="23" w16cid:durableId="2044745370">
-    <w:abstractNumId w:val="14"/>
-  </w:num>
-  <w:num w:numId="24" w16cid:durableId="487212011">
-    <w:abstractNumId w:val="7"/>
-  </w:num>
-  <w:num w:numId="25" w16cid:durableId="1727491516">
-    <w:abstractNumId w:val="24"/>
-  </w:num>
-  <w:num w:numId="26" w16cid:durableId="1568299721">
-    <w:abstractNumId w:val="6"/>
-  </w:num>
-  <w:num w:numId="27" w16cid:durableId="1249119854">
-    <w:abstractNumId w:val="9"/>
-  </w:num>
   <w:num w:numId="28" w16cid:durableId="1479225693">
-    <w:abstractNumId w:val="23"/>
+    <w:abstractNumId w:val="26"/>
   </w:num>
   <w:num w:numId="29" w16cid:durableId="215436009">
-    <w:abstractNumId w:val="32"/>
+    <w:abstractNumId w:val="35"/>
   </w:num>
   <w:num w:numId="30" w16cid:durableId="1174761548">
     <w:abstractNumId w:val="1"/>
   </w:num>
   <w:num w:numId="31" w16cid:durableId="500124173">
-    <w:abstractNumId w:val="10"/>
+    <w:abstractNumId w:val="12"/>
   </w:num>
   <w:num w:numId="32" w16cid:durableId="604576718">
-    <w:abstractNumId w:val="17"/>
+    <w:abstractNumId w:val="19"/>
   </w:num>
   <w:num w:numId="33" w16cid:durableId="1841459030">
-    <w:abstractNumId w:val="25"/>
+    <w:abstractNumId w:val="28"/>
   </w:num>
   <w:num w:numId="34" w16cid:durableId="86269074">
     <w:abstractNumId w:val="0"/>
+  </w:num>
+  <w:num w:numId="35" w16cid:durableId="774178960">
+    <w:abstractNumId w:val="20"/>
+  </w:num>
+  <w:num w:numId="36" w16cid:durableId="1516577215">
+    <w:abstractNumId w:val="2"/>
+  </w:num>
+  <w:num w:numId="37" w16cid:durableId="1473986928">
+    <w:abstractNumId w:val="7"/>
   </w:num>
 </w:numbering>
 </file>

</xml_diff>